<commit_message>
docs(report): align telemed report with current system
</commit_message>
<xml_diff>
--- a/Report_Telemed_TH.docx
+++ b/Report_Telemed_TH.docx
@@ -1,6 +1,6 @@
 
 <file path=word/document.xml><?xml version="1.0" encoding="utf-8"?>
-<w:document xmlns:wpc="http://schemas.microsoft.com/office/word/2010/wordprocessingCanvas" xmlns:cx="http://schemas.microsoft.com/office/drawing/2014/chartex" xmlns:cx1="http://schemas.microsoft.com/office/drawing/2015/9/8/chartex" xmlns:cx2="http://schemas.microsoft.com/office/drawing/2015/10/21/chartex" xmlns:cx3="http://schemas.microsoft.com/office/drawing/2016/5/9/chartex" xmlns:cx4="http://schemas.microsoft.com/office/drawing/2016/5/10/chartex" xmlns:cx5="http://schemas.microsoft.com/office/drawing/2016/5/11/chartex" xmlns:cx6="http://schemas.microsoft.com/office/drawing/2016/5/12/chartex" xmlns:cx7="http://schemas.microsoft.com/office/drawing/2016/5/13/chartex" xmlns:cx8="http://schemas.microsoft.com/office/drawing/2016/5/14/chartex" xmlns:mc="http://schemas.openxmlformats.org/markup-compatibility/2006" xmlns:aink="http://schemas.microsoft.com/office/drawing/2016/ink" xmlns:am3d="http://schemas.microsoft.com/office/drawing/2017/model3d" xmlns:o="urn:schemas-microsoft-com:office:office" xmlns:oel="http://schemas.microsoft.com/office/2019/extlst" xmlns:r="http://schemas.openxmlformats.org/officeDocument/2006/relationships" xmlns:m="http://schemas.openxmlformats.org/officeDocument/2006/math" xmlns:v="urn:schemas-microsoft-com:vml" xmlns:wp14="http://schemas.microsoft.com/office/word/2010/wordprocessingDrawing" xmlns:wp="http://schemas.openxmlformats.org/drawingml/2006/wordprocessingDrawing" xmlns:w10="urn:schemas-microsoft-com:office:word" xmlns:w="http://schemas.openxmlformats.org/wordprocessingml/2006/main" xmlns:w14="http://schemas.microsoft.com/office/word/2010/wordml" xmlns:w15="http://schemas.microsoft.com/office/word/2012/wordml" xmlns:w16cex="http://schemas.microsoft.com/office/word/2018/wordml/cex" xmlns:w16cid="http://schemas.microsoft.com/office/word/2016/wordml/cid" xmlns:w16="http://schemas.microsoft.com/office/word/2018/wordml" xmlns:w16du="http://schemas.microsoft.com/office/word/2023/wordml/word16du" xmlns:w16sdtdh="http://schemas.microsoft.com/office/word/2020/wordml/sdtdatahash" xmlns:w16sdtfl="http://schemas.microsoft.com/office/word/2024/wordml/sdtformatlock" xmlns:w16se="http://schemas.microsoft.com/office/word/2015/wordml/symex" xmlns:wpg="http://schemas.microsoft.com/office/word/2010/wordprocessingGroup" xmlns:wpi="http://schemas.microsoft.com/office/word/2010/wordprocessingInk" xmlns:wne="http://schemas.microsoft.com/office/word/2006/wordml" xmlns:wps="http://schemas.microsoft.com/office/word/2010/wordprocessingShape" mc:Ignorable="w14 w15 w16se w16cid w16 w16cex w16sdtdh w16sdtfl w16du wp14">
+<w:document xmlns:mc="http://schemas.openxmlformats.org/markup-compatibility/2006" xmlns:r="http://schemas.openxmlformats.org/officeDocument/2006/relationships" xmlns:w="http://schemas.openxmlformats.org/wordprocessingml/2006/main" xmlns:w14="http://schemas.microsoft.com/office/word/2010/wordml" mc:Ignorable="w14 w15 w16se w16cid w16 w16cex w16sdtdh w16sdtfl w16du wp14">
   <w:body>
     <w:p/>
     <w:p/>
@@ -2213,117 +2213,8 @@
         <w:spacing w:after="120"/>
         <w:ind w:firstLine="720"/>
       </w:pPr>
-      <w:proofErr w:type="spellStart"/>
-      <w:r>
-        <w:t>ระบบใช้แนวคิด</w:t>
-      </w:r>
-      <w:proofErr w:type="spellEnd"/>
-      <w:r>
-        <w:t xml:space="preserve"> RBAC </w:t>
-      </w:r>
-      <w:proofErr w:type="spellStart"/>
-      <w:r>
-        <w:t>ในการควบคุมสิทธิ์การเข้าถึง</w:t>
-      </w:r>
-      <w:proofErr w:type="spellEnd"/>
-      <w:r>
-        <w:t xml:space="preserve"> </w:t>
-      </w:r>
-      <w:proofErr w:type="spellStart"/>
-      <w:r>
-        <w:t>โดยกำหนดบทบาทของผู้ใช้งาน</w:t>
-      </w:r>
-      <w:proofErr w:type="spellEnd"/>
-      <w:r>
-        <w:t xml:space="preserve"> 8 </w:t>
-      </w:r>
-      <w:proofErr w:type="spellStart"/>
-      <w:r>
-        <w:t>ประเภท</w:t>
-      </w:r>
-      <w:proofErr w:type="spellEnd"/>
-      <w:r>
-        <w:t xml:space="preserve"> </w:t>
-      </w:r>
-      <w:proofErr w:type="spellStart"/>
-      <w:r>
-        <w:t>ได้แก่</w:t>
-      </w:r>
-      <w:proofErr w:type="spellEnd"/>
-      <w:r>
-        <w:t xml:space="preserve"> Admin, Staff, Doctor, Nurse, Pharmacist, Medical Technologist, Psychologist </w:t>
-      </w:r>
-      <w:proofErr w:type="spellStart"/>
-      <w:r>
-        <w:t>และ</w:t>
-      </w:r>
-      <w:proofErr w:type="spellEnd"/>
-      <w:r>
-        <w:t xml:space="preserve"> Patient </w:t>
-      </w:r>
-      <w:proofErr w:type="spellStart"/>
-      <w:r>
-        <w:t>แต่ละบทบาทมีสิทธิ์ในการเข้าถึงหน้าจอและ</w:t>
-      </w:r>
-      <w:proofErr w:type="spellEnd"/>
-      <w:r>
-        <w:t xml:space="preserve"> API </w:t>
-      </w:r>
-      <w:proofErr w:type="spellStart"/>
-      <w:r>
-        <w:t>ที่แตกต่างกัน</w:t>
-      </w:r>
-      <w:proofErr w:type="spellEnd"/>
-      <w:r>
-        <w:t xml:space="preserve"> </w:t>
-      </w:r>
-      <w:proofErr w:type="spellStart"/>
-      <w:r>
-        <w:t>เช่น</w:t>
-      </w:r>
-      <w:proofErr w:type="spellEnd"/>
-      <w:r>
-        <w:t xml:space="preserve"> </w:t>
-      </w:r>
-      <w:proofErr w:type="spellStart"/>
-      <w:r>
-        <w:t>เฉพาะ</w:t>
-      </w:r>
-      <w:proofErr w:type="spellEnd"/>
-      <w:r>
-        <w:t xml:space="preserve"> Admin </w:t>
-      </w:r>
-      <w:proofErr w:type="spellStart"/>
-      <w:r>
-        <w:t>เท่านั้นที่สามารถจัดการผู้ใช้งาน</w:t>
-      </w:r>
-      <w:proofErr w:type="spellEnd"/>
-      <w:r>
-        <w:t xml:space="preserve"> </w:t>
-      </w:r>
-      <w:proofErr w:type="spellStart"/>
-      <w:r>
-        <w:t>ดู</w:t>
-      </w:r>
-      <w:proofErr w:type="spellEnd"/>
-      <w:r>
-        <w:t xml:space="preserve"> Audit Log </w:t>
-      </w:r>
-      <w:proofErr w:type="spellStart"/>
-      <w:r>
-        <w:t>และตั้งค่าความปลอดภัยได้</w:t>
-      </w:r>
-      <w:proofErr w:type="spellEnd"/>
-      <w:r>
-        <w:t xml:space="preserve"> </w:t>
-      </w:r>
-      <w:proofErr w:type="spellStart"/>
-      <w:r>
-        <w:t>ขณะที่</w:t>
-      </w:r>
-      <w:proofErr w:type="spellEnd"/>
-      <w:r>
-        <w:t xml:space="preserve"> Doctor สามารถจัดการข้อมูลผู้ป่วยและนัดหมายได้เฉพาะผู้ป่วยที่ได้รับมอบหมาย</w:t>
+      <w:r>
+        <w:t>ระบบใช้แนวคิด RBAC ในการควบคุมสิทธิ์การเข้าถึงสำหรับผู้ใช้งานภายในระบบ โดยกำหนดบทบาท 7 ประเภท ได้แก่ Admin, Staff, Doctor, Nurse, Pharmacist, Medical Technologist และ Psychologist แต่ละบทบาทมีสิทธิ์ในการเข้าถึงหน้าจอและ API ที่แตกต่างกัน เช่น เฉพาะ Admin เท่านั้นที่สามารถจัดการผู้ใช้งาน ดู Audit Log และตั้งค่าความปลอดภัยได้ ขณะที่ Doctor สามารถจัดการข้อมูลผู้ป่วยและนัดหมายได้เฉพาะผู้ป่วยที่ได้รับมอบหมาย ส่วนผู้ป่วยเข้าถึงบริการผ่าน patient-app และ patient token flow ที่แยกจาก RBAC ของบุคลากร</w:t>
       </w:r>
     </w:p>
     <w:p>
@@ -3036,29 +2927,8 @@
         <w:spacing w:after="120"/>
         <w:ind w:firstLine="720"/>
       </w:pPr>
-      <w:proofErr w:type="spellStart"/>
-      <w:r>
-        <w:t>ระบบรองรับผู้ใช้งาน</w:t>
-      </w:r>
-      <w:proofErr w:type="spellEnd"/>
-      <w:r>
-        <w:t xml:space="preserve"> 8 </w:t>
-      </w:r>
-      <w:proofErr w:type="spellStart"/>
-      <w:r>
-        <w:t>บทบาท</w:t>
-      </w:r>
-      <w:proofErr w:type="spellEnd"/>
-      <w:r>
-        <w:t xml:space="preserve"> </w:t>
-      </w:r>
-      <w:proofErr w:type="spellStart"/>
-      <w:r>
-        <w:t>โดยบทบาททางคลินิก</w:t>
-      </w:r>
-      <w:proofErr w:type="spellEnd"/>
-      <w:r>
-        <w:t xml:space="preserve"> (Doctor, Nurse, Pharmacist, Medical Technologist, Psychologist) ต้องผ่านการตรวจสอบใบอนุญาตประกอบวิชาชีพในขั้นตอนการเชิญเข้าใช้งาน</w:t>
+      <w:r>
+        <w:t>ระบบรองรับผู้ใช้งานภายใน 7 บทบาท โดยบทบาททางคลินิก (Doctor, Nurse, Pharmacist, Medical Technologist, Psychologist) ต้องผ่านการตรวจสอบใบอนุญาตประกอบวิชาชีพในขั้นตอนการเชิญเข้าใช้งาน ส่วนผู้ป่วยใช้งานผ่าน patient-app ซึ่งแยกจาก RBAC ของบุคลากร</w:t>
       </w:r>
     </w:p>
     <w:tbl>
@@ -4083,152 +3953,6 @@
           </w:p>
         </w:tc>
       </w:tr>
-      <w:tr>
-        <w:tblPrEx>
-          <w:tblCellMar>
-            <w:top w:w="0" w:type="dxa"/>
-            <w:bottom w:w="0" w:type="dxa"/>
-          </w:tblCellMar>
-        </w:tblPrEx>
-        <w:tc>
-          <w:tcPr>
-            <w:tcW w:w="1800" w:type="dxa"/>
-            <w:tcBorders>
-              <w:top w:val="single" w:sz="1" w:space="0" w:color="999999"/>
-              <w:left w:val="single" w:sz="1" w:space="0" w:color="999999"/>
-              <w:bottom w:val="single" w:sz="1" w:space="0" w:color="999999"/>
-              <w:right w:val="single" w:sz="1" w:space="0" w:color="999999"/>
-            </w:tcBorders>
-            <w:tcMar>
-              <w:top w:w="60" w:type="dxa"/>
-              <w:left w:w="100" w:type="dxa"/>
-              <w:bottom w:w="60" w:type="dxa"/>
-              <w:right w:w="100" w:type="dxa"/>
-            </w:tcMar>
-          </w:tcPr>
-          <w:p>
-            <w:pPr>
-              <w:spacing w:before="40" w:after="40"/>
-            </w:pPr>
-            <w:r>
-              <w:rPr>
-                <w:color w:val="000000"/>
-                <w:sz w:val="28"/>
-                <w:szCs w:val="28"/>
-              </w:rPr>
-              <w:t>Patient</w:t>
-            </w:r>
-          </w:p>
-        </w:tc>
-        <w:tc>
-          <w:tcPr>
-            <w:tcW w:w="2800" w:type="dxa"/>
-            <w:tcBorders>
-              <w:top w:val="single" w:sz="1" w:space="0" w:color="999999"/>
-              <w:left w:val="single" w:sz="1" w:space="0" w:color="999999"/>
-              <w:bottom w:val="single" w:sz="1" w:space="0" w:color="999999"/>
-              <w:right w:val="single" w:sz="1" w:space="0" w:color="999999"/>
-            </w:tcBorders>
-            <w:tcMar>
-              <w:top w:w="60" w:type="dxa"/>
-              <w:left w:w="100" w:type="dxa"/>
-              <w:bottom w:w="60" w:type="dxa"/>
-              <w:right w:w="100" w:type="dxa"/>
-            </w:tcMar>
-          </w:tcPr>
-          <w:p>
-            <w:pPr>
-              <w:spacing w:before="40" w:after="40"/>
-            </w:pPr>
-            <w:proofErr w:type="spellStart"/>
-            <w:r>
-              <w:rPr>
-                <w:color w:val="000000"/>
-                <w:sz w:val="28"/>
-                <w:szCs w:val="28"/>
-              </w:rPr>
-              <w:t>ผู้ป่วย</w:t>
-            </w:r>
-            <w:proofErr w:type="spellEnd"/>
-            <w:r>
-              <w:rPr>
-                <w:color w:val="000000"/>
-                <w:sz w:val="28"/>
-                <w:szCs w:val="28"/>
-              </w:rPr>
-              <w:t xml:space="preserve"> (</w:t>
-            </w:r>
-            <w:proofErr w:type="spellStart"/>
-            <w:r>
-              <w:rPr>
-                <w:color w:val="000000"/>
-                <w:sz w:val="28"/>
-                <w:szCs w:val="28"/>
-              </w:rPr>
-              <w:t>ภายนอก</w:t>
-            </w:r>
-            <w:proofErr w:type="spellEnd"/>
-            <w:r>
-              <w:rPr>
-                <w:color w:val="000000"/>
-                <w:sz w:val="28"/>
-                <w:szCs w:val="28"/>
-              </w:rPr>
-              <w:t>)</w:t>
-            </w:r>
-          </w:p>
-        </w:tc>
-        <w:tc>
-          <w:tcPr>
-            <w:tcW w:w="3706" w:type="dxa"/>
-            <w:tcBorders>
-              <w:top w:val="single" w:sz="1" w:space="0" w:color="999999"/>
-              <w:left w:val="single" w:sz="1" w:space="0" w:color="999999"/>
-              <w:bottom w:val="single" w:sz="1" w:space="0" w:color="999999"/>
-              <w:right w:val="single" w:sz="1" w:space="0" w:color="999999"/>
-            </w:tcBorders>
-            <w:tcMar>
-              <w:top w:w="60" w:type="dxa"/>
-              <w:left w:w="100" w:type="dxa"/>
-              <w:bottom w:w="60" w:type="dxa"/>
-              <w:right w:w="100" w:type="dxa"/>
-            </w:tcMar>
-          </w:tcPr>
-          <w:p>
-            <w:pPr>
-              <w:spacing w:before="40" w:after="40"/>
-            </w:pPr>
-            <w:proofErr w:type="spellStart"/>
-            <w:r>
-              <w:rPr>
-                <w:color w:val="000000"/>
-                <w:sz w:val="28"/>
-                <w:szCs w:val="28"/>
-              </w:rPr>
-              <w:t>เข้าร่วมวิดีโอคอล</w:t>
-            </w:r>
-            <w:proofErr w:type="spellEnd"/>
-            <w:r>
-              <w:rPr>
-                <w:color w:val="000000"/>
-                <w:sz w:val="28"/>
-                <w:szCs w:val="28"/>
-              </w:rPr>
-              <w:t xml:space="preserve">, </w:t>
-            </w:r>
-            <w:proofErr w:type="spellStart"/>
-            <w:r>
-              <w:rPr>
-                <w:color w:val="000000"/>
-                <w:sz w:val="28"/>
-                <w:szCs w:val="28"/>
-              </w:rPr>
-              <w:t>ใช้แอปมือถือ</w:t>
-            </w:r>
-            <w:proofErr w:type="spellEnd"/>
-          </w:p>
-        </w:tc>
-      </w:tr>
     </w:tbl>
     <w:p>
       <w:pPr>
@@ -4248,75 +3972,9 @@
         <w:spacing w:after="120"/>
         <w:ind w:firstLine="720"/>
       </w:pPr>
-      <w:proofErr w:type="spellStart"/>
-      <w:r>
-        <w:t>ระบบใช้</w:t>
-      </w:r>
-      <w:proofErr w:type="spellEnd"/>
-      <w:r>
-        <w:t xml:space="preserve"> PostgreSQL </w:t>
-      </w:r>
-      <w:proofErr w:type="spellStart"/>
-      <w:r>
-        <w:t>เป็นฐานข้อมูลหลัก</w:t>
-      </w:r>
-      <w:proofErr w:type="spellEnd"/>
-      <w:r>
-        <w:t xml:space="preserve"> </w:t>
-      </w:r>
-      <w:proofErr w:type="spellStart"/>
-      <w:r>
-        <w:t>มีตารางข้อมูลทั้งหมด</w:t>
-      </w:r>
-      <w:proofErr w:type="spellEnd"/>
-      <w:r>
-        <w:t xml:space="preserve"> 23 </w:t>
-      </w:r>
-      <w:proofErr w:type="spellStart"/>
-      <w:r>
-        <w:t>ตาราง</w:t>
-      </w:r>
-      <w:proofErr w:type="spellEnd"/>
-      <w:r>
-        <w:t xml:space="preserve"> </w:t>
-      </w:r>
-      <w:proofErr w:type="spellStart"/>
-      <w:r>
-        <w:t>จัดการผ่าน</w:t>
-      </w:r>
-      <w:proofErr w:type="spellEnd"/>
-      <w:r>
-        <w:t xml:space="preserve"> </w:t>
-      </w:r>
-      <w:proofErr w:type="spellStart"/>
-      <w:r>
-        <w:t>SQLAlchemy</w:t>
-      </w:r>
-      <w:proofErr w:type="spellEnd"/>
-      <w:r>
-        <w:t xml:space="preserve"> ORM </w:t>
-      </w:r>
-      <w:proofErr w:type="spellStart"/>
-      <w:r>
-        <w:t>และ</w:t>
-      </w:r>
-      <w:proofErr w:type="spellEnd"/>
-      <w:r>
-        <w:t xml:space="preserve"> Alembic Migration </w:t>
-      </w:r>
-      <w:proofErr w:type="spellStart"/>
-      <w:r>
-        <w:t>แบ่งเป็น</w:t>
-      </w:r>
-      <w:proofErr w:type="spellEnd"/>
-      <w:r>
-        <w:t xml:space="preserve"> 5 </w:t>
-      </w:r>
-      <w:proofErr w:type="spellStart"/>
-      <w:r>
-        <w:t>กลุ่มหลัก</w:t>
-      </w:r>
-      <w:proofErr w:type="spellEnd"/>
+      <w:r>
+        <w:t>ระบบใช้ PostgreSQL เป็นฐานข้อมูลหลัก มีตารางข้อมูลทั้งหมด 24 ตาราง จัดการผ่าน SQLAlchemy ORM และ Alembic Migration แบ่งเป็น 5 กลุ่มหลัก</w:t>
+      </w:r>
     </w:p>
     <w:p>
       <w:pPr>
@@ -4868,6 +4526,74 @@
             <w:pPr>
               <w:spacing w:before="40" w:after="40"/>
             </w:pPr>
+            <w:r>
+              <w:rPr>
+                <w:color w:val="000000"/>
+                <w:sz w:val="28"/>
+                <w:szCs w:val="28"/>
+              </w:rPr>
+              <w:t>PatientAppRegistration</w:t>
+            </w:r>
+          </w:p>
+        </w:tc>
+        <w:tc>
+          <w:tcPr>
+            <w:tcW w:w="5506" w:type="dxa"/>
+            <w:tcBorders>
+              <w:top w:val="single" w:sz="1" w:space="0" w:color="999999"/>
+              <w:left w:val="single" w:sz="1" w:space="0" w:color="999999"/>
+              <w:bottom w:val="single" w:sz="1" w:space="0" w:color="999999"/>
+              <w:right w:val="single" w:sz="1" w:space="0" w:color="999999"/>
+            </w:tcBorders>
+            <w:tcMar>
+              <w:top w:w="60" w:type="dxa"/>
+              <w:left w:w="100" w:type="dxa"/>
+              <w:bottom w:w="60" w:type="dxa"/>
+              <w:right w:w="100" w:type="dxa"/>
+            </w:tcMar>
+          </w:tcPr>
+          <w:p>
+            <w:pPr>
+              <w:spacing w:before="40" w:after="40"/>
+            </w:pPr>
+            <w:r>
+              <w:rPr>
+                <w:color w:val="000000"/>
+                <w:sz w:val="28"/>
+                <w:szCs w:val="28"/>
+              </w:rPr>
+              <w:t>patient_id, code, is_used, expires_at</w:t>
+            </w:r>
+          </w:p>
+        </w:tc>
+      </w:tr>
+      <w:tr>
+        <w:tblPrEx>
+          <w:tblCellMar>
+            <w:top w:w="0" w:type="dxa"/>
+            <w:bottom w:w="0" w:type="dxa"/>
+          </w:tblCellMar>
+        </w:tblPrEx>
+        <w:tc>
+          <w:tcPr>
+            <w:tcW w:w="2800" w:type="dxa"/>
+            <w:tcBorders>
+              <w:top w:val="single" w:sz="1" w:space="0" w:color="999999"/>
+              <w:left w:val="single" w:sz="1" w:space="0" w:color="999999"/>
+              <w:bottom w:val="single" w:sz="1" w:space="0" w:color="999999"/>
+              <w:right w:val="single" w:sz="1" w:space="0" w:color="999999"/>
+            </w:tcBorders>
+            <w:tcMar>
+              <w:top w:w="60" w:type="dxa"/>
+              <w:left w:w="100" w:type="dxa"/>
+              <w:bottom w:w="60" w:type="dxa"/>
+              <w:right w:w="100" w:type="dxa"/>
+            </w:tcMar>
+          </w:tcPr>
+          <w:p>
+            <w:pPr>
+              <w:spacing w:before="40" w:after="40"/>
+            </w:pPr>
             <w:proofErr w:type="spellStart"/>
             <w:r>
               <w:rPr>
@@ -5244,6 +4970,74 @@
               <w:t>risk_score</w:t>
             </w:r>
             <w:proofErr w:type="spellEnd"/>
+          </w:p>
+        </w:tc>
+      </w:tr>
+      <w:tr>
+        <w:tblPrEx>
+          <w:tblCellMar>
+            <w:top w:w="0" w:type="dxa"/>
+            <w:bottom w:w="0" w:type="dxa"/>
+          </w:tblCellMar>
+        </w:tblPrEx>
+        <w:tc>
+          <w:tcPr>
+            <w:tcW w:w="2800" w:type="dxa"/>
+            <w:tcBorders>
+              <w:top w:val="single" w:sz="1" w:space="0" w:color="999999"/>
+              <w:left w:val="single" w:sz="1" w:space="0" w:color="999999"/>
+              <w:bottom w:val="single" w:sz="1" w:space="0" w:color="999999"/>
+              <w:right w:val="single" w:sz="1" w:space="0" w:color="999999"/>
+            </w:tcBorders>
+            <w:tcMar>
+              <w:top w:w="60" w:type="dxa"/>
+              <w:left w:w="100" w:type="dxa"/>
+              <w:bottom w:w="60" w:type="dxa"/>
+              <w:right w:w="100" w:type="dxa"/>
+            </w:tcMar>
+          </w:tcPr>
+          <w:p>
+            <w:pPr>
+              <w:spacing w:before="40" w:after="40"/>
+            </w:pPr>
+            <w:r>
+              <w:rPr>
+                <w:color w:val="000000"/>
+                <w:sz w:val="28"/>
+                <w:szCs w:val="28"/>
+              </w:rPr>
+              <w:t>TimelineEvent</w:t>
+            </w:r>
+          </w:p>
+        </w:tc>
+        <w:tc>
+          <w:tcPr>
+            <w:tcW w:w="5506" w:type="dxa"/>
+            <w:tcBorders>
+              <w:top w:val="single" w:sz="1" w:space="0" w:color="999999"/>
+              <w:left w:val="single" w:sz="1" w:space="0" w:color="999999"/>
+              <w:bottom w:val="single" w:sz="1" w:space="0" w:color="999999"/>
+              <w:right w:val="single" w:sz="1" w:space="0" w:color="999999"/>
+            </w:tcBorders>
+            <w:tcMar>
+              <w:top w:w="60" w:type="dxa"/>
+              <w:left w:w="100" w:type="dxa"/>
+              <w:bottom w:w="60" w:type="dxa"/>
+              <w:right w:w="100" w:type="dxa"/>
+            </w:tcMar>
+          </w:tcPr>
+          <w:p>
+            <w:pPr>
+              <w:spacing w:before="40" w:after="40"/>
+            </w:pPr>
+            <w:r>
+              <w:rPr>
+                <w:color w:val="000000"/>
+                <w:sz w:val="28"/>
+                <w:szCs w:val="28"/>
+              </w:rPr>
+              <w:t>event_type, event_time, title, is_abnormal</w:t>
+            </w:r>
           </w:p>
         </w:tc>
       </w:tr>
@@ -8161,57 +7955,12 @@
         <w:spacing w:before="80" w:after="80"/>
         <w:ind w:firstLine="720"/>
       </w:pPr>
-      <w:proofErr w:type="spellStart"/>
-      <w:r>
-        <w:rPr>
-          <w:b/>
-          <w:bCs/>
-        </w:rPr>
-        <w:lastRenderedPageBreak/>
-        <w:t>ชั้นที่</w:t>
-      </w:r>
-      <w:proofErr w:type="spellEnd"/>
-      <w:r>
-        <w:rPr>
-          <w:b/>
-          <w:bCs/>
-        </w:rPr>
-        <w:t xml:space="preserve"> 2 </w:t>
-      </w:r>
-      <w:proofErr w:type="spellStart"/>
-      <w:r>
-        <w:rPr>
-          <w:b/>
-          <w:bCs/>
-        </w:rPr>
-        <w:t>การควบคุมสิทธิ์</w:t>
-      </w:r>
-      <w:proofErr w:type="spellEnd"/>
-      <w:r>
-        <w:rPr>
-          <w:b/>
-          <w:bCs/>
-        </w:rPr>
-        <w:t>:</w:t>
-      </w:r>
-      <w:r>
-        <w:t xml:space="preserve"> RBAC 8 </w:t>
-      </w:r>
-      <w:proofErr w:type="spellStart"/>
-      <w:r>
-        <w:t>บทบาท</w:t>
-      </w:r>
-      <w:proofErr w:type="spellEnd"/>
-      <w:r>
-        <w:t xml:space="preserve">, </w:t>
-      </w:r>
-      <w:proofErr w:type="spellStart"/>
-      <w:r>
-        <w:t>ตรวจสอบใบอนุญาตวิชาชีพ</w:t>
-      </w:r>
-      <w:proofErr w:type="spellEnd"/>
-      <w:r>
-        <w:t>, Doctor-Patient Assignment</w:t>
+      <w:r>
+        <w:rPr>
+          <w:b/>
+          <w:bCs/>
+        </w:rPr>
+        <w:t>ชั้นที่ 2 การควบคุมสิทธิ์: RBAC 7 บทบาทสำหรับบุคลากร, ตรวจสอบใบอนุญาตวิชาชีพ, Doctor-Patient Assignment, patient token สำหรับแอปผู้ป่วย</w:t>
       </w:r>
     </w:p>
     <w:p>
@@ -12402,70 +12151,13 @@
         <w:spacing w:before="80" w:after="80"/>
         <w:ind w:firstLine="720"/>
       </w:pPr>
-      <w:proofErr w:type="spellStart"/>
-      <w:r>
-        <w:rPr>
-          <w:b/>
-          <w:bCs/>
-        </w:rPr>
-        <w:t>ด้านการจัดการผู้ใช้งาน</w:t>
-      </w:r>
-      <w:proofErr w:type="spellEnd"/>
-      <w:r>
-        <w:rPr>
-          <w:b/>
-          <w:bCs/>
-        </w:rPr>
-        <w:t>:</w:t>
-      </w:r>
-      <w:r>
-        <w:t xml:space="preserve"> </w:t>
-      </w:r>
-      <w:proofErr w:type="spellStart"/>
-      <w:r>
-        <w:t>รองรับ</w:t>
-      </w:r>
-      <w:proofErr w:type="spellEnd"/>
-      <w:r>
-        <w:t xml:space="preserve"> 8 </w:t>
-      </w:r>
-      <w:proofErr w:type="spellStart"/>
-      <w:r>
-        <w:t>บทบาทพร้อมระบบ</w:t>
-      </w:r>
-      <w:proofErr w:type="spellEnd"/>
-      <w:r>
-        <w:t xml:space="preserve"> RBAC </w:t>
-      </w:r>
-      <w:proofErr w:type="spellStart"/>
-      <w:r>
-        <w:t>ครบถ้วน</w:t>
-      </w:r>
-      <w:proofErr w:type="spellEnd"/>
-      <w:r>
-        <w:t xml:space="preserve"> </w:t>
-      </w:r>
-      <w:proofErr w:type="spellStart"/>
-      <w:r>
-        <w:t>มีระบบเชิญผู้ใช้งาน</w:t>
-      </w:r>
-      <w:proofErr w:type="spellEnd"/>
-      <w:r>
-        <w:t xml:space="preserve"> </w:t>
-      </w:r>
-      <w:proofErr w:type="spellStart"/>
-      <w:r>
-        <w:t>ตรวจสอบใบอนุญาตวิชาชีพ</w:t>
-      </w:r>
-      <w:proofErr w:type="spellEnd"/>
-      <w:r>
-        <w:t xml:space="preserve"> </w:t>
-      </w:r>
-      <w:proofErr w:type="spellStart"/>
-      <w:r>
-        <w:t>และจัดการบัญชีทั้งหมด</w:t>
-      </w:r>
-      <w:proofErr w:type="spellEnd"/>
+      <w:r>
+        <w:rPr>
+          <w:b/>
+          <w:bCs/>
+        </w:rPr>
+        <w:t>ด้านการจัดการผู้ใช้งาน: รองรับ 7 บทบาทสำหรับบุคลากรพร้อมระบบ RBAC ครบถ้วน มีระบบเชิญผู้ใช้งาน ตรวจสอบใบอนุญาตวิชาชีพ และจัดการบัญชีทั้งหมด โดยผู้ป่วยใช้งานผ่าน mobile app flow แยกต่างหาก</w:t>
+      </w:r>
     </w:p>
     <w:p>
       <w:pPr>

</xml_diff>